<commit_message>
Add EPV-cap sensitivity analysis to Methods and Results docs
src/23_epv5_sensitivity.py: relaxes the LASSO EPV-10 feature cap to EPV-5
for the two most constrained cohorts (1-year flare, serial biopsy),
rerunning the same tuning + CV protocol on the automated (uncorrected)
selection to isolate the marginal effect of the cap.

Findings:
- 1-year flare: cap was materially constraining tree-model performance
  (RF/XGB/LGBM AUROC +0.03-0.05, calibration slopes much closer to 1.0
  when relaxed to EPV-5).
- Serial biopsy: no effect at all - LASSO's discrete C-grid lands on the
  same 2 features regardless of cap (already documented path behaviour).

Folded into Methods doc Section 12.2 (Limitations) and Results doc
Section 8.
</commit_message>
<xml_diff>
--- a/outputs/Lupus_Project_Methods.docx
+++ b/outputs/Lupus_Project_Methods.docx
@@ -20044,6 +20044,2346 @@
       </w:tr>
     </w:tbl>
     <w:p/>
+    <w:p>
+      <w:pPr>
+        <w:pStyle w:val="Heading1"/>
+        <w:spacing w:before="280" w:after="80"/>
+      </w:pPr>
+      <w:r>
+        <w:t>12. Limitations</w:t>
+      </w:r>
+    </w:p>
+    <w:p>
+      <w:pPr>
+        <w:pStyle w:val="Heading2"/>
+        <w:spacing w:before="160" w:after="80"/>
+      </w:pPr>
+      <w:r>
+        <w:t>12.1 Sample Size (src/22_pmsampsize.py)</w:t>
+      </w:r>
+    </w:p>
+    <w:p>
+      <w:pPr>
+        <w:spacing w:after="120"/>
+      </w:pPr>
+      <w:r>
+        <w:t>Feature selection throughout this pipeline was constrained by the Events Per Variable (EPV-10) heuristic (Section 4.2): the maximum number of predictors was capped at floor(events / 10) for each cohort. EPV-10 is a widely used rule of thumb, but it is a coarse heuristic that ignores the anticipated discriminative ability of the model. To obtain a more rigorous, model-specific estimate of whether each cohort's sample size was adequate, the closed-form minimum sample size criteria of Riley et al. 2020 (BMJ 368:m441) were applied post hoc to each cohort, using its final predictor count, observed event prevalence, and its own optimism-adjusted (bias-corrected) Logistic Regression AUROC as the anticipated C-statistic (LR is the paper's designated primary model, and Riley et al. recommend an optimism-adjusted C-statistic for this purpose).</w:t>
+      </w:r>
+    </w:p>
+    <w:tbl>
+      <w:tblPr>
+        <w:tblStyle w:val="TableGrid"/>
+        <w:tblW w:type="auto" w:w="0"/>
+        <w:jc w:val="center"/>
+        <w:tblLook w:firstColumn="1" w:firstRow="1" w:lastColumn="0" w:lastRow="0" w:noHBand="0" w:noVBand="1" w:val="04A0"/>
+      </w:tblPr>
+      <w:tblGrid>
+        <w:gridCol w:w="1295"/>
+        <w:gridCol w:w="1295"/>
+        <w:gridCol w:w="1295"/>
+        <w:gridCol w:w="1295"/>
+        <w:gridCol w:w="1295"/>
+        <w:gridCol w:w="1295"/>
+        <w:gridCol w:w="1295"/>
+      </w:tblGrid>
+      <w:tr>
+        <w:tc>
+          <w:tcPr>
+            <w:tcW w:type="dxa" w:w="2268"/>
+            <w:shd w:val="clear" w:color="auto" w:fill="BDD7EE"/>
+          </w:tcPr>
+          <w:p>
+            <w:r>
+              <w:rPr>
+                <w:b/>
+                <w:sz w:val="20"/>
+              </w:rPr>
+              <w:t>Cohort</w:t>
+            </w:r>
+          </w:p>
+        </w:tc>
+        <w:tc>
+          <w:tcPr>
+            <w:tcW w:type="dxa" w:w="850"/>
+            <w:shd w:val="clear" w:color="auto" w:fill="BDD7EE"/>
+          </w:tcPr>
+          <w:p>
+            <w:r>
+              <w:rPr>
+                <w:b/>
+                <w:sz w:val="20"/>
+              </w:rPr>
+              <w:t>p</w:t>
+            </w:r>
+          </w:p>
+        </w:tc>
+        <w:tc>
+          <w:tcPr>
+            <w:tcW w:type="dxa" w:w="1701"/>
+            <w:shd w:val="clear" w:color="auto" w:fill="BDD7EE"/>
+          </w:tcPr>
+          <w:p>
+            <w:r>
+              <w:rPr>
+                <w:b/>
+                <w:sz w:val="20"/>
+              </w:rPr>
+              <w:t>C-stat (LR, BC)</w:t>
+            </w:r>
+          </w:p>
+        </w:tc>
+        <w:tc>
+          <w:tcPr>
+            <w:tcW w:type="dxa" w:w="1417"/>
+            <w:shd w:val="clear" w:color="auto" w:fill="BDD7EE"/>
+          </w:tcPr>
+          <w:p>
+            <w:r>
+              <w:rPr>
+                <w:b/>
+                <w:sz w:val="20"/>
+              </w:rPr>
+              <w:t>n required</w:t>
+            </w:r>
+          </w:p>
+        </w:tc>
+        <w:tc>
+          <w:tcPr>
+            <w:tcW w:type="dxa" w:w="1417"/>
+            <w:shd w:val="clear" w:color="auto" w:fill="BDD7EE"/>
+          </w:tcPr>
+          <w:p>
+            <w:r>
+              <w:rPr>
+                <w:b/>
+                <w:sz w:val="20"/>
+              </w:rPr>
+              <w:t>n actual</w:t>
+            </w:r>
+          </w:p>
+        </w:tc>
+        <w:tc>
+          <w:tcPr>
+            <w:tcW w:type="dxa" w:w="1417"/>
+            <w:shd w:val="clear" w:color="auto" w:fill="BDD7EE"/>
+          </w:tcPr>
+          <w:p>
+            <w:r>
+              <w:rPr>
+                <w:b/>
+                <w:sz w:val="20"/>
+              </w:rPr>
+              <w:t>EPV actual</w:t>
+            </w:r>
+          </w:p>
+        </w:tc>
+        <w:tc>
+          <w:tcPr>
+            <w:tcW w:type="dxa" w:w="1417"/>
+            <w:shd w:val="clear" w:color="auto" w:fill="BDD7EE"/>
+          </w:tcPr>
+          <w:p>
+            <w:r>
+              <w:rPr>
+                <w:b/>
+                <w:sz w:val="20"/>
+              </w:rPr>
+              <w:t>Adequate?</w:t>
+            </w:r>
+          </w:p>
+        </w:tc>
+      </w:tr>
+      <w:tr>
+        <w:tc>
+          <w:tcPr>
+            <w:tcW w:type="dxa" w:w="2268"/>
+          </w:tcPr>
+          <w:p>
+            <w:r>
+              <w:rPr>
+                <w:sz w:val="20"/>
+              </w:rPr>
+              <w:t>1-Year flare</w:t>
+            </w:r>
+          </w:p>
+        </w:tc>
+        <w:tc>
+          <w:tcPr>
+            <w:tcW w:type="dxa" w:w="850"/>
+          </w:tcPr>
+          <w:p>
+            <w:r>
+              <w:rPr>
+                <w:sz w:val="20"/>
+              </w:rPr>
+              <w:t>9</w:t>
+            </w:r>
+          </w:p>
+        </w:tc>
+        <w:tc>
+          <w:tcPr>
+            <w:tcW w:type="dxa" w:w="1701"/>
+          </w:tcPr>
+          <w:p>
+            <w:r>
+              <w:rPr>
+                <w:sz w:val="20"/>
+              </w:rPr>
+              <w:t>0.709</w:t>
+            </w:r>
+          </w:p>
+        </w:tc>
+        <w:tc>
+          <w:tcPr>
+            <w:tcW w:type="dxa" w:w="1417"/>
+          </w:tcPr>
+          <w:p>
+            <w:r>
+              <w:rPr>
+                <w:sz w:val="20"/>
+              </w:rPr>
+              <w:t>795</w:t>
+            </w:r>
+          </w:p>
+        </w:tc>
+        <w:tc>
+          <w:tcPr>
+            <w:tcW w:type="dxa" w:w="1417"/>
+          </w:tcPr>
+          <w:p>
+            <w:r>
+              <w:rPr>
+                <w:sz w:val="20"/>
+              </w:rPr>
+              <w:t>430</w:t>
+            </w:r>
+          </w:p>
+        </w:tc>
+        <w:tc>
+          <w:tcPr>
+            <w:tcW w:type="dxa" w:w="1417"/>
+          </w:tcPr>
+          <w:p>
+            <w:r>
+              <w:rPr>
+                <w:sz w:val="20"/>
+              </w:rPr>
+              <w:t>11.00</w:t>
+            </w:r>
+          </w:p>
+        </w:tc>
+        <w:tc>
+          <w:tcPr>
+            <w:tcW w:type="dxa" w:w="1417"/>
+          </w:tcPr>
+          <w:p>
+            <w:r>
+              <w:rPr>
+                <w:sz w:val="20"/>
+              </w:rPr>
+              <w:t>No</w:t>
+            </w:r>
+          </w:p>
+        </w:tc>
+      </w:tr>
+      <w:tr>
+        <w:tc>
+          <w:tcPr>
+            <w:tcW w:type="dxa" w:w="2268"/>
+            <w:shd w:val="clear" w:color="auto" w:fill="F2F2F2"/>
+          </w:tcPr>
+          <w:p>
+            <w:r>
+              <w:rPr>
+                <w:sz w:val="20"/>
+              </w:rPr>
+              <w:t>5-Year flare</w:t>
+            </w:r>
+          </w:p>
+        </w:tc>
+        <w:tc>
+          <w:tcPr>
+            <w:tcW w:type="dxa" w:w="850"/>
+            <w:shd w:val="clear" w:color="auto" w:fill="F2F2F2"/>
+          </w:tcPr>
+          <w:p>
+            <w:r>
+              <w:rPr>
+                <w:sz w:val="20"/>
+              </w:rPr>
+              <w:t>10</w:t>
+            </w:r>
+          </w:p>
+        </w:tc>
+        <w:tc>
+          <w:tcPr>
+            <w:tcW w:type="dxa" w:w="1701"/>
+            <w:shd w:val="clear" w:color="auto" w:fill="F2F2F2"/>
+          </w:tcPr>
+          <w:p>
+            <w:r>
+              <w:rPr>
+                <w:sz w:val="20"/>
+              </w:rPr>
+              <w:t>0.670</w:t>
+            </w:r>
+          </w:p>
+        </w:tc>
+        <w:tc>
+          <w:tcPr>
+            <w:tcW w:type="dxa" w:w="1417"/>
+            <w:shd w:val="clear" w:color="auto" w:fill="F2F2F2"/>
+          </w:tcPr>
+          <w:p>
+            <w:r>
+              <w:rPr>
+                <w:sz w:val="20"/>
+              </w:rPr>
+              <w:t>976</w:t>
+            </w:r>
+          </w:p>
+        </w:tc>
+        <w:tc>
+          <w:tcPr>
+            <w:tcW w:type="dxa" w:w="1417"/>
+            <w:shd w:val="clear" w:color="auto" w:fill="F2F2F2"/>
+          </w:tcPr>
+          <w:p>
+            <w:r>
+              <w:rPr>
+                <w:sz w:val="20"/>
+              </w:rPr>
+              <w:t>356</w:t>
+            </w:r>
+          </w:p>
+        </w:tc>
+        <w:tc>
+          <w:tcPr>
+            <w:tcW w:type="dxa" w:w="1417"/>
+            <w:shd w:val="clear" w:color="auto" w:fill="F2F2F2"/>
+          </w:tcPr>
+          <w:p>
+            <w:r>
+              <w:rPr>
+                <w:sz w:val="20"/>
+              </w:rPr>
+              <w:t>16.60</w:t>
+            </w:r>
+          </w:p>
+        </w:tc>
+        <w:tc>
+          <w:tcPr>
+            <w:tcW w:type="dxa" w:w="1417"/>
+            <w:shd w:val="clear" w:color="auto" w:fill="F2F2F2"/>
+          </w:tcPr>
+          <w:p>
+            <w:r>
+              <w:rPr>
+                <w:sz w:val="20"/>
+              </w:rPr>
+              <w:t>No</w:t>
+            </w:r>
+          </w:p>
+        </w:tc>
+      </w:tr>
+      <w:tr>
+        <w:tc>
+          <w:tcPr>
+            <w:tcW w:type="dxa" w:w="2268"/>
+          </w:tcPr>
+          <w:p>
+            <w:r>
+              <w:rPr>
+                <w:sz w:val="20"/>
+              </w:rPr>
+              <w:t>Serial biopsy</w:t>
+            </w:r>
+          </w:p>
+        </w:tc>
+        <w:tc>
+          <w:tcPr>
+            <w:tcW w:type="dxa" w:w="850"/>
+          </w:tcPr>
+          <w:p>
+            <w:r>
+              <w:rPr>
+                <w:sz w:val="20"/>
+              </w:rPr>
+              <w:t>2</w:t>
+            </w:r>
+          </w:p>
+        </w:tc>
+        <w:tc>
+          <w:tcPr>
+            <w:tcW w:type="dxa" w:w="1701"/>
+          </w:tcPr>
+          <w:p>
+            <w:r>
+              <w:rPr>
+                <w:sz w:val="20"/>
+              </w:rPr>
+              <w:t>0.660</w:t>
+            </w:r>
+          </w:p>
+        </w:tc>
+        <w:tc>
+          <w:tcPr>
+            <w:tcW w:type="dxa" w:w="1417"/>
+          </w:tcPr>
+          <w:p>
+            <w:r>
+              <w:rPr>
+                <w:sz w:val="20"/>
+              </w:rPr>
+              <w:t>384</w:t>
+            </w:r>
+          </w:p>
+        </w:tc>
+        <w:tc>
+          <w:tcPr>
+            <w:tcW w:type="dxa" w:w="1417"/>
+          </w:tcPr>
+          <w:p>
+            <w:r>
+              <w:rPr>
+                <w:sz w:val="20"/>
+              </w:rPr>
+              <w:t>70</w:t>
+            </w:r>
+          </w:p>
+        </w:tc>
+        <w:tc>
+          <w:tcPr>
+            <w:tcW w:type="dxa" w:w="1417"/>
+          </w:tcPr>
+          <w:p>
+            <w:r>
+              <w:rPr>
+                <w:sz w:val="20"/>
+              </w:rPr>
+              <w:t>17.00</w:t>
+            </w:r>
+          </w:p>
+        </w:tc>
+        <w:tc>
+          <w:tcPr>
+            <w:tcW w:type="dxa" w:w="1417"/>
+          </w:tcPr>
+          <w:p>
+            <w:r>
+              <w:rPr>
+                <w:sz w:val="20"/>
+              </w:rPr>
+              <w:t>No</w:t>
+            </w:r>
+          </w:p>
+        </w:tc>
+      </w:tr>
+      <w:tr>
+        <w:tc>
+          <w:tcPr>
+            <w:tcW w:type="dxa" w:w="2268"/>
+            <w:shd w:val="clear" w:color="auto" w:fill="F2F2F2"/>
+          </w:tcPr>
+          <w:p>
+            <w:r>
+              <w:rPr>
+                <w:sz w:val="20"/>
+              </w:rPr>
+              <w:t>ESRD 5-Year</w:t>
+            </w:r>
+          </w:p>
+        </w:tc>
+        <w:tc>
+          <w:tcPr>
+            <w:tcW w:type="dxa" w:w="850"/>
+            <w:shd w:val="clear" w:color="auto" w:fill="F2F2F2"/>
+          </w:tcPr>
+          <w:p>
+            <w:r>
+              <w:rPr>
+                <w:sz w:val="20"/>
+              </w:rPr>
+              <w:t>5</w:t>
+            </w:r>
+          </w:p>
+        </w:tc>
+        <w:tc>
+          <w:tcPr>
+            <w:tcW w:type="dxa" w:w="1701"/>
+            <w:shd w:val="clear" w:color="auto" w:fill="F2F2F2"/>
+          </w:tcPr>
+          <w:p>
+            <w:r>
+              <w:rPr>
+                <w:sz w:val="20"/>
+              </w:rPr>
+              <w:t>0.797</w:t>
+            </w:r>
+          </w:p>
+        </w:tc>
+        <w:tc>
+          <w:tcPr>
+            <w:tcW w:type="dxa" w:w="1417"/>
+            <w:shd w:val="clear" w:color="auto" w:fill="F2F2F2"/>
+          </w:tcPr>
+          <w:p>
+            <w:r>
+              <w:rPr>
+                <w:sz w:val="20"/>
+              </w:rPr>
+              <w:t>294</w:t>
+            </w:r>
+          </w:p>
+        </w:tc>
+        <w:tc>
+          <w:tcPr>
+            <w:tcW w:type="dxa" w:w="1417"/>
+            <w:shd w:val="clear" w:color="auto" w:fill="F2F2F2"/>
+          </w:tcPr>
+          <w:p>
+            <w:r>
+              <w:rPr>
+                <w:sz w:val="20"/>
+              </w:rPr>
+              <w:t>796</w:t>
+            </w:r>
+          </w:p>
+        </w:tc>
+        <w:tc>
+          <w:tcPr>
+            <w:tcW w:type="dxa" w:w="1417"/>
+            <w:shd w:val="clear" w:color="auto" w:fill="F2F2F2"/>
+          </w:tcPr>
+          <w:p>
+            <w:r>
+              <w:rPr>
+                <w:sz w:val="20"/>
+              </w:rPr>
+              <w:t>22.40</w:t>
+            </w:r>
+          </w:p>
+        </w:tc>
+        <w:tc>
+          <w:tcPr>
+            <w:tcW w:type="dxa" w:w="1417"/>
+            <w:shd w:val="clear" w:color="auto" w:fill="F2F2F2"/>
+          </w:tcPr>
+          <w:p>
+            <w:r>
+              <w:rPr>
+                <w:sz w:val="20"/>
+              </w:rPr>
+              <w:t>Yes</w:t>
+            </w:r>
+          </w:p>
+        </w:tc>
+      </w:tr>
+      <w:tr>
+        <w:tc>
+          <w:tcPr>
+            <w:tcW w:type="dxa" w:w="2268"/>
+          </w:tcPr>
+          <w:p>
+            <w:r>
+              <w:rPr>
+                <w:sz w:val="20"/>
+              </w:rPr>
+              <w:t>ESRD 10-Year</w:t>
+            </w:r>
+          </w:p>
+        </w:tc>
+        <w:tc>
+          <w:tcPr>
+            <w:tcW w:type="dxa" w:w="850"/>
+          </w:tcPr>
+          <w:p>
+            <w:r>
+              <w:rPr>
+                <w:sz w:val="20"/>
+              </w:rPr>
+              <w:t>17</w:t>
+            </w:r>
+          </w:p>
+        </w:tc>
+        <w:tc>
+          <w:tcPr>
+            <w:tcW w:type="dxa" w:w="1701"/>
+          </w:tcPr>
+          <w:p>
+            <w:r>
+              <w:rPr>
+                <w:sz w:val="20"/>
+              </w:rPr>
+              <w:t>0.817</w:t>
+            </w:r>
+          </w:p>
+        </w:tc>
+        <w:tc>
+          <w:tcPr>
+            <w:tcW w:type="dxa" w:w="1417"/>
+          </w:tcPr>
+          <w:p>
+            <w:r>
+              <w:rPr>
+                <w:sz w:val="20"/>
+              </w:rPr>
+              <w:t>620</w:t>
+            </w:r>
+          </w:p>
+        </w:tc>
+        <w:tc>
+          <w:tcPr>
+            <w:tcW w:type="dxa" w:w="1417"/>
+          </w:tcPr>
+          <w:p>
+            <w:r>
+              <w:rPr>
+                <w:sz w:val="20"/>
+              </w:rPr>
+              <w:t>796</w:t>
+            </w:r>
+          </w:p>
+        </w:tc>
+        <w:tc>
+          <w:tcPr>
+            <w:tcW w:type="dxa" w:w="1417"/>
+          </w:tcPr>
+          <w:p>
+            <w:r>
+              <w:rPr>
+                <w:sz w:val="20"/>
+              </w:rPr>
+              <w:t>10.29</w:t>
+            </w:r>
+          </w:p>
+        </w:tc>
+        <w:tc>
+          <w:tcPr>
+            <w:tcW w:type="dxa" w:w="1417"/>
+          </w:tcPr>
+          <w:p>
+            <w:r>
+              <w:rPr>
+                <w:sz w:val="20"/>
+              </w:rPr>
+              <w:t>Yes</w:t>
+            </w:r>
+          </w:p>
+        </w:tc>
+      </w:tr>
+    </w:tbl>
+    <w:p/>
+    <w:p>
+      <w:pPr>
+        <w:spacing w:after="120"/>
+      </w:pPr>
+      <w:r>
+        <w:t>EPV-10 and Riley's formal criteria disagree for the three flare cohorts: all three are underpowered by pmsampsize despite meeting or exceeding EPV-10 (1-year EPV=11.00, 5-year EPV=16.60, serial EPV=17.00), because their lower discrimination (C-statistic 0.660–0.709) requires substantially more events to control overfitting and estimate the intercept precisely. Both ESRD cohorts are formally adequate by these criteria — notably, ESRD 10-year passes despite an EPV of only 10.29, since its higher discrimination (C=0.817) needs proportionally fewer events. This indicates the true sample-size shortfall in the flare cohorts, and particularly the serial biopsy sub-analysis, is real and larger than the EPV-10 heuristic alone suggests; results from these three cohorts should be interpreted as hypothesis-generating rather than confirmatory. The ESRD 5-year and 10-year analyses are adequately powered by both the EPV-10 heuristic and the more rigorous Riley et al. criteria.</w:t>
+      </w:r>
+    </w:p>
+    <w:p>
+      <w:pPr>
+        <w:pStyle w:val="Heading2"/>
+        <w:spacing w:before="160" w:after="80"/>
+      </w:pPr>
+      <w:r>
+        <w:t>12.2 EPV Cap Sensitivity (src/23_epv5_sensitivity.py)</w:t>
+      </w:r>
+    </w:p>
+    <w:p>
+      <w:pPr>
+        <w:spacing w:after="120"/>
+      </w:pPr>
+      <w:r>
+        <w:t>As a direct test of whether the EPV-10 feature cap was materially constraining model performance, the automated LASSO-capped feature selection (Section 4.1, steps 3a-6) was rerun with the cap relaxed to an EPV-5 rule for the two most constrained cohorts (1-year flare and serial biopsy), and the same tuning + CV protocol was applied to the resulting feature sets. This reruns only the automated selection — it does not reproduce the manual post-selection clinical corrections described in Sections 4.3/4.5, so the feature lists and resulting AUROCs below differ from the published final models; the purpose here is only to isolate the marginal effect of the cap itself.</w:t>
+      </w:r>
+    </w:p>
+    <w:tbl>
+      <w:tblPr>
+        <w:tblStyle w:val="TableGrid"/>
+        <w:tblW w:type="auto" w:w="0"/>
+        <w:jc w:val="center"/>
+        <w:tblLook w:firstColumn="1" w:firstRow="1" w:lastColumn="0" w:lastRow="0" w:noHBand="0" w:noVBand="1" w:val="04A0"/>
+      </w:tblPr>
+      <w:tblGrid>
+        <w:gridCol w:w="1295"/>
+        <w:gridCol w:w="1295"/>
+        <w:gridCol w:w="1295"/>
+        <w:gridCol w:w="1295"/>
+        <w:gridCol w:w="1295"/>
+        <w:gridCol w:w="1295"/>
+        <w:gridCol w:w="1295"/>
+      </w:tblGrid>
+      <w:tr>
+        <w:tc>
+          <w:tcPr>
+            <w:tcW w:type="dxa" w:w="1701"/>
+            <w:shd w:val="clear" w:color="auto" w:fill="BDD7EE"/>
+          </w:tcPr>
+          <w:p>
+            <w:r>
+              <w:rPr>
+                <w:b/>
+                <w:sz w:val="20"/>
+              </w:rPr>
+              <w:t>Cohort</w:t>
+            </w:r>
+          </w:p>
+        </w:tc>
+        <w:tc>
+          <w:tcPr>
+            <w:tcW w:type="dxa" w:w="1984"/>
+            <w:shd w:val="clear" w:color="auto" w:fill="BDD7EE"/>
+          </w:tcPr>
+          <w:p>
+            <w:r>
+              <w:rPr>
+                <w:b/>
+                <w:sz w:val="20"/>
+              </w:rPr>
+              <w:t>Cap</w:t>
+            </w:r>
+          </w:p>
+        </w:tc>
+        <w:tc>
+          <w:tcPr>
+            <w:tcW w:type="dxa" w:w="1134"/>
+            <w:shd w:val="clear" w:color="auto" w:fill="BDD7EE"/>
+          </w:tcPr>
+          <w:p>
+            <w:r>
+              <w:rPr>
+                <w:b/>
+                <w:sz w:val="20"/>
+              </w:rPr>
+              <w:t>N features</w:t>
+            </w:r>
+          </w:p>
+        </w:tc>
+        <w:tc>
+          <w:tcPr>
+            <w:tcW w:type="dxa" w:w="1984"/>
+            <w:shd w:val="clear" w:color="auto" w:fill="BDD7EE"/>
+          </w:tcPr>
+          <w:p>
+            <w:r>
+              <w:rPr>
+                <w:b/>
+                <w:sz w:val="20"/>
+              </w:rPr>
+              <w:t>Model</w:t>
+            </w:r>
+          </w:p>
+        </w:tc>
+        <w:tc>
+          <w:tcPr>
+            <w:tcW w:type="dxa" w:w="1134"/>
+            <w:shd w:val="clear" w:color="auto" w:fill="BDD7EE"/>
+          </w:tcPr>
+          <w:p>
+            <w:r>
+              <w:rPr>
+                <w:b/>
+                <w:sz w:val="20"/>
+              </w:rPr>
+              <w:t>CV AUROC</w:t>
+            </w:r>
+          </w:p>
+        </w:tc>
+        <w:tc>
+          <w:tcPr>
+            <w:tcW w:type="dxa" w:w="1134"/>
+            <w:shd w:val="clear" w:color="auto" w:fill="BDD7EE"/>
+          </w:tcPr>
+          <w:p>
+            <w:r>
+              <w:rPr>
+                <w:b/>
+                <w:sz w:val="20"/>
+              </w:rPr>
+              <w:t>CV Brier</w:t>
+            </w:r>
+          </w:p>
+        </w:tc>
+        <w:tc>
+          <w:tcPr>
+            <w:tcW w:type="dxa" w:w="1417"/>
+            <w:shd w:val="clear" w:color="auto" w:fill="BDD7EE"/>
+          </w:tcPr>
+          <w:p>
+            <w:r>
+              <w:rPr>
+                <w:b/>
+                <w:sz w:val="20"/>
+              </w:rPr>
+              <w:t>CV Cal Slope</w:t>
+            </w:r>
+          </w:p>
+        </w:tc>
+      </w:tr>
+      <w:tr>
+        <w:tc>
+          <w:tcPr>
+            <w:tcW w:type="dxa" w:w="1701"/>
+          </w:tcPr>
+          <w:p>
+            <w:r>
+              <w:rPr>
+                <w:sz w:val="20"/>
+              </w:rPr>
+              <w:t>1-Year flare</w:t>
+            </w:r>
+          </w:p>
+        </w:tc>
+        <w:tc>
+          <w:tcPr>
+            <w:tcW w:type="dxa" w:w="1984"/>
+          </w:tcPr>
+          <w:p>
+            <w:r>
+              <w:rPr>
+                <w:sz w:val="20"/>
+              </w:rPr>
+              <w:t>EPV-10 (cap=12)</w:t>
+            </w:r>
+          </w:p>
+        </w:tc>
+        <w:tc>
+          <w:tcPr>
+            <w:tcW w:type="dxa" w:w="1134"/>
+          </w:tcPr>
+          <w:p>
+            <w:r>
+              <w:rPr>
+                <w:sz w:val="20"/>
+              </w:rPr>
+              <w:t>12</w:t>
+            </w:r>
+          </w:p>
+        </w:tc>
+        <w:tc>
+          <w:tcPr>
+            <w:tcW w:type="dxa" w:w="1984"/>
+          </w:tcPr>
+          <w:p>
+            <w:r>
+              <w:rPr>
+                <w:sz w:val="20"/>
+              </w:rPr>
+              <w:t>Logistic Regression</w:t>
+            </w:r>
+          </w:p>
+        </w:tc>
+        <w:tc>
+          <w:tcPr>
+            <w:tcW w:type="dxa" w:w="1134"/>
+          </w:tcPr>
+          <w:p>
+            <w:r>
+              <w:rPr>
+                <w:sz w:val="20"/>
+              </w:rPr>
+              <w:t>0.702</w:t>
+            </w:r>
+          </w:p>
+        </w:tc>
+        <w:tc>
+          <w:tcPr>
+            <w:tcW w:type="dxa" w:w="1134"/>
+          </w:tcPr>
+          <w:p>
+            <w:r>
+              <w:rPr>
+                <w:sz w:val="20"/>
+              </w:rPr>
+              <w:t>0.219</w:t>
+            </w:r>
+          </w:p>
+        </w:tc>
+        <w:tc>
+          <w:tcPr>
+            <w:tcW w:type="dxa" w:w="1417"/>
+          </w:tcPr>
+          <w:p>
+            <w:r>
+              <w:rPr>
+                <w:sz w:val="20"/>
+              </w:rPr>
+              <w:t>0.640</w:t>
+            </w:r>
+          </w:p>
+        </w:tc>
+      </w:tr>
+      <w:tr>
+        <w:tc>
+          <w:tcPr>
+            <w:tcW w:type="dxa" w:w="1701"/>
+            <w:shd w:val="clear" w:color="auto" w:fill="F2F2F2"/>
+          </w:tcPr>
+          <w:p>
+            <w:r>
+              <w:rPr>
+                <w:sz w:val="20"/>
+              </w:rPr>
+              <w:t>1-Year flare</w:t>
+            </w:r>
+          </w:p>
+        </w:tc>
+        <w:tc>
+          <w:tcPr>
+            <w:tcW w:type="dxa" w:w="1984"/>
+            <w:shd w:val="clear" w:color="auto" w:fill="F2F2F2"/>
+          </w:tcPr>
+          <w:p>
+            <w:r>
+              <w:rPr>
+                <w:sz w:val="20"/>
+              </w:rPr>
+              <w:t>EPV-10 (cap=12)</w:t>
+            </w:r>
+          </w:p>
+        </w:tc>
+        <w:tc>
+          <w:tcPr>
+            <w:tcW w:type="dxa" w:w="1134"/>
+            <w:shd w:val="clear" w:color="auto" w:fill="F2F2F2"/>
+          </w:tcPr>
+          <w:p>
+            <w:r>
+              <w:rPr>
+                <w:sz w:val="20"/>
+              </w:rPr>
+              <w:t>12</w:t>
+            </w:r>
+          </w:p>
+        </w:tc>
+        <w:tc>
+          <w:tcPr>
+            <w:tcW w:type="dxa" w:w="1984"/>
+            <w:shd w:val="clear" w:color="auto" w:fill="F2F2F2"/>
+          </w:tcPr>
+          <w:p>
+            <w:r>
+              <w:rPr>
+                <w:sz w:val="20"/>
+              </w:rPr>
+              <w:t>Random Forest</w:t>
+            </w:r>
+          </w:p>
+        </w:tc>
+        <w:tc>
+          <w:tcPr>
+            <w:tcW w:type="dxa" w:w="1134"/>
+            <w:shd w:val="clear" w:color="auto" w:fill="F2F2F2"/>
+          </w:tcPr>
+          <w:p>
+            <w:r>
+              <w:rPr>
+                <w:sz w:val="20"/>
+              </w:rPr>
+              <w:t>0.691</w:t>
+            </w:r>
+          </w:p>
+        </w:tc>
+        <w:tc>
+          <w:tcPr>
+            <w:tcW w:type="dxa" w:w="1134"/>
+            <w:shd w:val="clear" w:color="auto" w:fill="F2F2F2"/>
+          </w:tcPr>
+          <w:p>
+            <w:r>
+              <w:rPr>
+                <w:sz w:val="20"/>
+              </w:rPr>
+              <w:t>0.187</w:t>
+            </w:r>
+          </w:p>
+        </w:tc>
+        <w:tc>
+          <w:tcPr>
+            <w:tcW w:type="dxa" w:w="1417"/>
+            <w:shd w:val="clear" w:color="auto" w:fill="F2F2F2"/>
+          </w:tcPr>
+          <w:p>
+            <w:r>
+              <w:rPr>
+                <w:sz w:val="20"/>
+              </w:rPr>
+              <w:t>0.719</w:t>
+            </w:r>
+          </w:p>
+        </w:tc>
+      </w:tr>
+      <w:tr>
+        <w:tc>
+          <w:tcPr>
+            <w:tcW w:type="dxa" w:w="1701"/>
+          </w:tcPr>
+          <w:p>
+            <w:r>
+              <w:rPr>
+                <w:sz w:val="20"/>
+              </w:rPr>
+              <w:t>1-Year flare</w:t>
+            </w:r>
+          </w:p>
+        </w:tc>
+        <w:tc>
+          <w:tcPr>
+            <w:tcW w:type="dxa" w:w="1984"/>
+          </w:tcPr>
+          <w:p>
+            <w:r>
+              <w:rPr>
+                <w:sz w:val="20"/>
+              </w:rPr>
+              <w:t>EPV-10 (cap=12)</w:t>
+            </w:r>
+          </w:p>
+        </w:tc>
+        <w:tc>
+          <w:tcPr>
+            <w:tcW w:type="dxa" w:w="1134"/>
+          </w:tcPr>
+          <w:p>
+            <w:r>
+              <w:rPr>
+                <w:sz w:val="20"/>
+              </w:rPr>
+              <w:t>12</w:t>
+            </w:r>
+          </w:p>
+        </w:tc>
+        <w:tc>
+          <w:tcPr>
+            <w:tcW w:type="dxa" w:w="1984"/>
+          </w:tcPr>
+          <w:p>
+            <w:r>
+              <w:rPr>
+                <w:sz w:val="20"/>
+              </w:rPr>
+              <w:t>XGBoost</w:t>
+            </w:r>
+          </w:p>
+        </w:tc>
+        <w:tc>
+          <w:tcPr>
+            <w:tcW w:type="dxa" w:w="1134"/>
+          </w:tcPr>
+          <w:p>
+            <w:r>
+              <w:rPr>
+                <w:sz w:val="20"/>
+              </w:rPr>
+              <w:t>0.684</w:t>
+            </w:r>
+          </w:p>
+        </w:tc>
+        <w:tc>
+          <w:tcPr>
+            <w:tcW w:type="dxa" w:w="1134"/>
+          </w:tcPr>
+          <w:p>
+            <w:r>
+              <w:rPr>
+                <w:sz w:val="20"/>
+              </w:rPr>
+              <w:t>0.236</w:t>
+            </w:r>
+          </w:p>
+        </w:tc>
+        <w:tc>
+          <w:tcPr>
+            <w:tcW w:type="dxa" w:w="1417"/>
+          </w:tcPr>
+          <w:p>
+            <w:r>
+              <w:rPr>
+                <w:sz w:val="20"/>
+              </w:rPr>
+              <w:t>0.506</w:t>
+            </w:r>
+          </w:p>
+        </w:tc>
+      </w:tr>
+      <w:tr>
+        <w:tc>
+          <w:tcPr>
+            <w:tcW w:type="dxa" w:w="1701"/>
+            <w:shd w:val="clear" w:color="auto" w:fill="F2F2F2"/>
+          </w:tcPr>
+          <w:p>
+            <w:r>
+              <w:rPr>
+                <w:sz w:val="20"/>
+              </w:rPr>
+              <w:t>1-Year flare</w:t>
+            </w:r>
+          </w:p>
+        </w:tc>
+        <w:tc>
+          <w:tcPr>
+            <w:tcW w:type="dxa" w:w="1984"/>
+            <w:shd w:val="clear" w:color="auto" w:fill="F2F2F2"/>
+          </w:tcPr>
+          <w:p>
+            <w:r>
+              <w:rPr>
+                <w:sz w:val="20"/>
+              </w:rPr>
+              <w:t>EPV-10 (cap=12)</w:t>
+            </w:r>
+          </w:p>
+        </w:tc>
+        <w:tc>
+          <w:tcPr>
+            <w:tcW w:type="dxa" w:w="1134"/>
+            <w:shd w:val="clear" w:color="auto" w:fill="F2F2F2"/>
+          </w:tcPr>
+          <w:p>
+            <w:r>
+              <w:rPr>
+                <w:sz w:val="20"/>
+              </w:rPr>
+              <w:t>12</w:t>
+            </w:r>
+          </w:p>
+        </w:tc>
+        <w:tc>
+          <w:tcPr>
+            <w:tcW w:type="dxa" w:w="1984"/>
+            <w:shd w:val="clear" w:color="auto" w:fill="F2F2F2"/>
+          </w:tcPr>
+          <w:p>
+            <w:r>
+              <w:rPr>
+                <w:sz w:val="20"/>
+              </w:rPr>
+              <w:t>LightGBM</w:t>
+            </w:r>
+          </w:p>
+        </w:tc>
+        <w:tc>
+          <w:tcPr>
+            <w:tcW w:type="dxa" w:w="1134"/>
+            <w:shd w:val="clear" w:color="auto" w:fill="F2F2F2"/>
+          </w:tcPr>
+          <w:p>
+            <w:r>
+              <w:rPr>
+                <w:sz w:val="20"/>
+              </w:rPr>
+              <w:t>0.664</w:t>
+            </w:r>
+          </w:p>
+        </w:tc>
+        <w:tc>
+          <w:tcPr>
+            <w:tcW w:type="dxa" w:w="1134"/>
+            <w:shd w:val="clear" w:color="auto" w:fill="F2F2F2"/>
+          </w:tcPr>
+          <w:p>
+            <w:r>
+              <w:rPr>
+                <w:sz w:val="20"/>
+              </w:rPr>
+              <w:t>0.219</w:t>
+            </w:r>
+          </w:p>
+        </w:tc>
+        <w:tc>
+          <w:tcPr>
+            <w:tcW w:type="dxa" w:w="1417"/>
+            <w:shd w:val="clear" w:color="auto" w:fill="F2F2F2"/>
+          </w:tcPr>
+          <w:p>
+            <w:r>
+              <w:rPr>
+                <w:sz w:val="20"/>
+              </w:rPr>
+              <w:t>0.753</w:t>
+            </w:r>
+          </w:p>
+        </w:tc>
+      </w:tr>
+      <w:tr>
+        <w:tc>
+          <w:tcPr>
+            <w:tcW w:type="dxa" w:w="1701"/>
+          </w:tcPr>
+          <w:p>
+            <w:r>
+              <w:rPr>
+                <w:sz w:val="20"/>
+              </w:rPr>
+              <w:t>1-Year flare</w:t>
+            </w:r>
+          </w:p>
+        </w:tc>
+        <w:tc>
+          <w:tcPr>
+            <w:tcW w:type="dxa" w:w="1984"/>
+          </w:tcPr>
+          <w:p>
+            <w:r>
+              <w:rPr>
+                <w:sz w:val="20"/>
+              </w:rPr>
+              <w:t>EPV-5 (cap=19)</w:t>
+            </w:r>
+          </w:p>
+        </w:tc>
+        <w:tc>
+          <w:tcPr>
+            <w:tcW w:type="dxa" w:w="1134"/>
+          </w:tcPr>
+          <w:p>
+            <w:r>
+              <w:rPr>
+                <w:sz w:val="20"/>
+              </w:rPr>
+              <w:t>19</w:t>
+            </w:r>
+          </w:p>
+        </w:tc>
+        <w:tc>
+          <w:tcPr>
+            <w:tcW w:type="dxa" w:w="1984"/>
+          </w:tcPr>
+          <w:p>
+            <w:r>
+              <w:rPr>
+                <w:sz w:val="20"/>
+              </w:rPr>
+              <w:t>Logistic Regression</w:t>
+            </w:r>
+          </w:p>
+        </w:tc>
+        <w:tc>
+          <w:tcPr>
+            <w:tcW w:type="dxa" w:w="1134"/>
+          </w:tcPr>
+          <w:p>
+            <w:r>
+              <w:rPr>
+                <w:sz w:val="20"/>
+              </w:rPr>
+              <w:t>0.681</w:t>
+            </w:r>
+          </w:p>
+        </w:tc>
+        <w:tc>
+          <w:tcPr>
+            <w:tcW w:type="dxa" w:w="1134"/>
+          </w:tcPr>
+          <w:p>
+            <w:r>
+              <w:rPr>
+                <w:sz w:val="20"/>
+              </w:rPr>
+              <w:t>0.225</w:t>
+            </w:r>
+          </w:p>
+        </w:tc>
+        <w:tc>
+          <w:tcPr>
+            <w:tcW w:type="dxa" w:w="1417"/>
+          </w:tcPr>
+          <w:p>
+            <w:r>
+              <w:rPr>
+                <w:sz w:val="20"/>
+              </w:rPr>
+              <w:t>0.535</w:t>
+            </w:r>
+          </w:p>
+        </w:tc>
+      </w:tr>
+      <w:tr>
+        <w:tc>
+          <w:tcPr>
+            <w:tcW w:type="dxa" w:w="1701"/>
+            <w:shd w:val="clear" w:color="auto" w:fill="F2F2F2"/>
+          </w:tcPr>
+          <w:p>
+            <w:r>
+              <w:rPr>
+                <w:sz w:val="20"/>
+              </w:rPr>
+              <w:t>1-Year flare</w:t>
+            </w:r>
+          </w:p>
+        </w:tc>
+        <w:tc>
+          <w:tcPr>
+            <w:tcW w:type="dxa" w:w="1984"/>
+            <w:shd w:val="clear" w:color="auto" w:fill="F2F2F2"/>
+          </w:tcPr>
+          <w:p>
+            <w:r>
+              <w:rPr>
+                <w:sz w:val="20"/>
+              </w:rPr>
+              <w:t>EPV-5 (cap=19)</w:t>
+            </w:r>
+          </w:p>
+        </w:tc>
+        <w:tc>
+          <w:tcPr>
+            <w:tcW w:type="dxa" w:w="1134"/>
+            <w:shd w:val="clear" w:color="auto" w:fill="F2F2F2"/>
+          </w:tcPr>
+          <w:p>
+            <w:r>
+              <w:rPr>
+                <w:sz w:val="20"/>
+              </w:rPr>
+              <w:t>19</w:t>
+            </w:r>
+          </w:p>
+        </w:tc>
+        <w:tc>
+          <w:tcPr>
+            <w:tcW w:type="dxa" w:w="1984"/>
+            <w:shd w:val="clear" w:color="auto" w:fill="F2F2F2"/>
+          </w:tcPr>
+          <w:p>
+            <w:r>
+              <w:rPr>
+                <w:sz w:val="20"/>
+              </w:rPr>
+              <w:t>Random Forest</w:t>
+            </w:r>
+          </w:p>
+        </w:tc>
+        <w:tc>
+          <w:tcPr>
+            <w:tcW w:type="dxa" w:w="1134"/>
+            <w:shd w:val="clear" w:color="auto" w:fill="F2F2F2"/>
+          </w:tcPr>
+          <w:p>
+            <w:r>
+              <w:rPr>
+                <w:sz w:val="20"/>
+              </w:rPr>
+              <w:t>0.731</w:t>
+            </w:r>
+          </w:p>
+        </w:tc>
+        <w:tc>
+          <w:tcPr>
+            <w:tcW w:type="dxa" w:w="1134"/>
+            <w:shd w:val="clear" w:color="auto" w:fill="F2F2F2"/>
+          </w:tcPr>
+          <w:p>
+            <w:r>
+              <w:rPr>
+                <w:sz w:val="20"/>
+              </w:rPr>
+              <w:t>0.175</w:t>
+            </w:r>
+          </w:p>
+        </w:tc>
+        <w:tc>
+          <w:tcPr>
+            <w:tcW w:type="dxa" w:w="1417"/>
+            <w:shd w:val="clear" w:color="auto" w:fill="F2F2F2"/>
+          </w:tcPr>
+          <w:p>
+            <w:r>
+              <w:rPr>
+                <w:sz w:val="20"/>
+              </w:rPr>
+              <w:t>0.855</w:t>
+            </w:r>
+          </w:p>
+        </w:tc>
+      </w:tr>
+      <w:tr>
+        <w:tc>
+          <w:tcPr>
+            <w:tcW w:type="dxa" w:w="1701"/>
+          </w:tcPr>
+          <w:p>
+            <w:r>
+              <w:rPr>
+                <w:sz w:val="20"/>
+              </w:rPr>
+              <w:t>1-Year flare</w:t>
+            </w:r>
+          </w:p>
+        </w:tc>
+        <w:tc>
+          <w:tcPr>
+            <w:tcW w:type="dxa" w:w="1984"/>
+          </w:tcPr>
+          <w:p>
+            <w:r>
+              <w:rPr>
+                <w:sz w:val="20"/>
+              </w:rPr>
+              <w:t>EPV-5 (cap=19)</w:t>
+            </w:r>
+          </w:p>
+        </w:tc>
+        <w:tc>
+          <w:tcPr>
+            <w:tcW w:type="dxa" w:w="1134"/>
+          </w:tcPr>
+          <w:p>
+            <w:r>
+              <w:rPr>
+                <w:sz w:val="20"/>
+              </w:rPr>
+              <w:t>19</w:t>
+            </w:r>
+          </w:p>
+        </w:tc>
+        <w:tc>
+          <w:tcPr>
+            <w:tcW w:type="dxa" w:w="1984"/>
+          </w:tcPr>
+          <w:p>
+            <w:r>
+              <w:rPr>
+                <w:sz w:val="20"/>
+              </w:rPr>
+              <w:t>XGBoost</w:t>
+            </w:r>
+          </w:p>
+        </w:tc>
+        <w:tc>
+          <w:tcPr>
+            <w:tcW w:type="dxa" w:w="1134"/>
+          </w:tcPr>
+          <w:p>
+            <w:r>
+              <w:rPr>
+                <w:sz w:val="20"/>
+              </w:rPr>
+              <w:t>0.720</w:t>
+            </w:r>
+          </w:p>
+        </w:tc>
+        <w:tc>
+          <w:tcPr>
+            <w:tcW w:type="dxa" w:w="1134"/>
+          </w:tcPr>
+          <w:p>
+            <w:r>
+              <w:rPr>
+                <w:sz w:val="20"/>
+              </w:rPr>
+              <w:t>0.223</w:t>
+            </w:r>
+          </w:p>
+        </w:tc>
+        <w:tc>
+          <w:tcPr>
+            <w:tcW w:type="dxa" w:w="1417"/>
+          </w:tcPr>
+          <w:p>
+            <w:r>
+              <w:rPr>
+                <w:sz w:val="20"/>
+              </w:rPr>
+              <w:t>0.886</w:t>
+            </w:r>
+          </w:p>
+        </w:tc>
+      </w:tr>
+      <w:tr>
+        <w:tc>
+          <w:tcPr>
+            <w:tcW w:type="dxa" w:w="1701"/>
+            <w:shd w:val="clear" w:color="auto" w:fill="F2F2F2"/>
+          </w:tcPr>
+          <w:p>
+            <w:r>
+              <w:rPr>
+                <w:sz w:val="20"/>
+              </w:rPr>
+              <w:t>1-Year flare</w:t>
+            </w:r>
+          </w:p>
+        </w:tc>
+        <w:tc>
+          <w:tcPr>
+            <w:tcW w:type="dxa" w:w="1984"/>
+            <w:shd w:val="clear" w:color="auto" w:fill="F2F2F2"/>
+          </w:tcPr>
+          <w:p>
+            <w:r>
+              <w:rPr>
+                <w:sz w:val="20"/>
+              </w:rPr>
+              <w:t>EPV-5 (cap=19)</w:t>
+            </w:r>
+          </w:p>
+        </w:tc>
+        <w:tc>
+          <w:tcPr>
+            <w:tcW w:type="dxa" w:w="1134"/>
+            <w:shd w:val="clear" w:color="auto" w:fill="F2F2F2"/>
+          </w:tcPr>
+          <w:p>
+            <w:r>
+              <w:rPr>
+                <w:sz w:val="20"/>
+              </w:rPr>
+              <w:t>19</w:t>
+            </w:r>
+          </w:p>
+        </w:tc>
+        <w:tc>
+          <w:tcPr>
+            <w:tcW w:type="dxa" w:w="1984"/>
+            <w:shd w:val="clear" w:color="auto" w:fill="F2F2F2"/>
+          </w:tcPr>
+          <w:p>
+            <w:r>
+              <w:rPr>
+                <w:sz w:val="20"/>
+              </w:rPr>
+              <w:t>LightGBM</w:t>
+            </w:r>
+          </w:p>
+        </w:tc>
+        <w:tc>
+          <w:tcPr>
+            <w:tcW w:type="dxa" w:w="1134"/>
+            <w:shd w:val="clear" w:color="auto" w:fill="F2F2F2"/>
+          </w:tcPr>
+          <w:p>
+            <w:r>
+              <w:rPr>
+                <w:sz w:val="20"/>
+              </w:rPr>
+              <w:t>0.715</w:t>
+            </w:r>
+          </w:p>
+        </w:tc>
+        <w:tc>
+          <w:tcPr>
+            <w:tcW w:type="dxa" w:w="1134"/>
+            <w:shd w:val="clear" w:color="auto" w:fill="F2F2F2"/>
+          </w:tcPr>
+          <w:p>
+            <w:r>
+              <w:rPr>
+                <w:sz w:val="20"/>
+              </w:rPr>
+              <w:t>0.186</w:t>
+            </w:r>
+          </w:p>
+        </w:tc>
+        <w:tc>
+          <w:tcPr>
+            <w:tcW w:type="dxa" w:w="1417"/>
+            <w:shd w:val="clear" w:color="auto" w:fill="F2F2F2"/>
+          </w:tcPr>
+          <w:p>
+            <w:r>
+              <w:rPr>
+                <w:sz w:val="20"/>
+              </w:rPr>
+              <w:t>0.722</w:t>
+            </w:r>
+          </w:p>
+        </w:tc>
+      </w:tr>
+      <w:tr>
+        <w:tc>
+          <w:tcPr>
+            <w:tcW w:type="dxa" w:w="1701"/>
+          </w:tcPr>
+          <w:p>
+            <w:r>
+              <w:rPr>
+                <w:sz w:val="20"/>
+              </w:rPr>
+              <w:t>Serial biopsy</w:t>
+            </w:r>
+          </w:p>
+        </w:tc>
+        <w:tc>
+          <w:tcPr>
+            <w:tcW w:type="dxa" w:w="1984"/>
+          </w:tcPr>
+          <w:p>
+            <w:r>
+              <w:rPr>
+                <w:sz w:val="20"/>
+              </w:rPr>
+              <w:t>EPV-10 (cap=4)</w:t>
+            </w:r>
+          </w:p>
+        </w:tc>
+        <w:tc>
+          <w:tcPr>
+            <w:tcW w:type="dxa" w:w="1134"/>
+          </w:tcPr>
+          <w:p>
+            <w:r>
+              <w:rPr>
+                <w:sz w:val="20"/>
+              </w:rPr>
+              <w:t>2</w:t>
+            </w:r>
+          </w:p>
+        </w:tc>
+        <w:tc>
+          <w:tcPr>
+            <w:tcW w:type="dxa" w:w="1984"/>
+          </w:tcPr>
+          <w:p>
+            <w:r>
+              <w:rPr>
+                <w:sz w:val="20"/>
+              </w:rPr>
+              <w:t>Logistic Regression</w:t>
+            </w:r>
+          </w:p>
+        </w:tc>
+        <w:tc>
+          <w:tcPr>
+            <w:tcW w:type="dxa" w:w="1134"/>
+          </w:tcPr>
+          <w:p>
+            <w:r>
+              <w:rPr>
+                <w:sz w:val="20"/>
+              </w:rPr>
+              <w:t>0.676</w:t>
+            </w:r>
+          </w:p>
+        </w:tc>
+        <w:tc>
+          <w:tcPr>
+            <w:tcW w:type="dxa" w:w="1134"/>
+          </w:tcPr>
+          <w:p>
+            <w:r>
+              <w:rPr>
+                <w:sz w:val="20"/>
+              </w:rPr>
+              <w:t>0.235</w:t>
+            </w:r>
+          </w:p>
+        </w:tc>
+        <w:tc>
+          <w:tcPr>
+            <w:tcW w:type="dxa" w:w="1417"/>
+          </w:tcPr>
+          <w:p>
+            <w:r>
+              <w:rPr>
+                <w:sz w:val="20"/>
+              </w:rPr>
+              <w:t>0.570</w:t>
+            </w:r>
+          </w:p>
+        </w:tc>
+      </w:tr>
+      <w:tr>
+        <w:tc>
+          <w:tcPr>
+            <w:tcW w:type="dxa" w:w="1701"/>
+            <w:shd w:val="clear" w:color="auto" w:fill="F2F2F2"/>
+          </w:tcPr>
+          <w:p>
+            <w:r>
+              <w:rPr>
+                <w:sz w:val="20"/>
+              </w:rPr>
+              <w:t>Serial biopsy</w:t>
+            </w:r>
+          </w:p>
+        </w:tc>
+        <w:tc>
+          <w:tcPr>
+            <w:tcW w:type="dxa" w:w="1984"/>
+            <w:shd w:val="clear" w:color="auto" w:fill="F2F2F2"/>
+          </w:tcPr>
+          <w:p>
+            <w:r>
+              <w:rPr>
+                <w:sz w:val="20"/>
+              </w:rPr>
+              <w:t>EPV-10 (cap=4)</w:t>
+            </w:r>
+          </w:p>
+        </w:tc>
+        <w:tc>
+          <w:tcPr>
+            <w:tcW w:type="dxa" w:w="1134"/>
+            <w:shd w:val="clear" w:color="auto" w:fill="F2F2F2"/>
+          </w:tcPr>
+          <w:p>
+            <w:r>
+              <w:rPr>
+                <w:sz w:val="20"/>
+              </w:rPr>
+              <w:t>2</w:t>
+            </w:r>
+          </w:p>
+        </w:tc>
+        <w:tc>
+          <w:tcPr>
+            <w:tcW w:type="dxa" w:w="1984"/>
+            <w:shd w:val="clear" w:color="auto" w:fill="F2F2F2"/>
+          </w:tcPr>
+          <w:p>
+            <w:r>
+              <w:rPr>
+                <w:sz w:val="20"/>
+              </w:rPr>
+              <w:t>Random Forest</w:t>
+            </w:r>
+          </w:p>
+        </w:tc>
+        <w:tc>
+          <w:tcPr>
+            <w:tcW w:type="dxa" w:w="1134"/>
+            <w:shd w:val="clear" w:color="auto" w:fill="F2F2F2"/>
+          </w:tcPr>
+          <w:p>
+            <w:r>
+              <w:rPr>
+                <w:sz w:val="20"/>
+              </w:rPr>
+              <w:t>0.629</w:t>
+            </w:r>
+          </w:p>
+        </w:tc>
+        <w:tc>
+          <w:tcPr>
+            <w:tcW w:type="dxa" w:w="1134"/>
+            <w:shd w:val="clear" w:color="auto" w:fill="F2F2F2"/>
+          </w:tcPr>
+          <w:p>
+            <w:r>
+              <w:rPr>
+                <w:sz w:val="20"/>
+              </w:rPr>
+              <w:t>0.240</w:t>
+            </w:r>
+          </w:p>
+        </w:tc>
+        <w:tc>
+          <w:tcPr>
+            <w:tcW w:type="dxa" w:w="1417"/>
+            <w:shd w:val="clear" w:color="auto" w:fill="F2F2F2"/>
+          </w:tcPr>
+          <w:p>
+            <w:r>
+              <w:rPr>
+                <w:sz w:val="20"/>
+              </w:rPr>
+              <w:t>0.381</w:t>
+            </w:r>
+          </w:p>
+        </w:tc>
+      </w:tr>
+      <w:tr>
+        <w:tc>
+          <w:tcPr>
+            <w:tcW w:type="dxa" w:w="1701"/>
+          </w:tcPr>
+          <w:p>
+            <w:r>
+              <w:rPr>
+                <w:sz w:val="20"/>
+              </w:rPr>
+              <w:t>Serial biopsy</w:t>
+            </w:r>
+          </w:p>
+        </w:tc>
+        <w:tc>
+          <w:tcPr>
+            <w:tcW w:type="dxa" w:w="1984"/>
+          </w:tcPr>
+          <w:p>
+            <w:r>
+              <w:rPr>
+                <w:sz w:val="20"/>
+              </w:rPr>
+              <w:t>EPV-10 (cap=4)</w:t>
+            </w:r>
+          </w:p>
+        </w:tc>
+        <w:tc>
+          <w:tcPr>
+            <w:tcW w:type="dxa" w:w="1134"/>
+          </w:tcPr>
+          <w:p>
+            <w:r>
+              <w:rPr>
+                <w:sz w:val="20"/>
+              </w:rPr>
+              <w:t>2</w:t>
+            </w:r>
+          </w:p>
+        </w:tc>
+        <w:tc>
+          <w:tcPr>
+            <w:tcW w:type="dxa" w:w="1984"/>
+          </w:tcPr>
+          <w:p>
+            <w:r>
+              <w:rPr>
+                <w:sz w:val="20"/>
+              </w:rPr>
+              <w:t>XGBoost</w:t>
+            </w:r>
+          </w:p>
+        </w:tc>
+        <w:tc>
+          <w:tcPr>
+            <w:tcW w:type="dxa" w:w="1134"/>
+          </w:tcPr>
+          <w:p>
+            <w:r>
+              <w:rPr>
+                <w:sz w:val="20"/>
+              </w:rPr>
+              <w:t>0.601</w:t>
+            </w:r>
+          </w:p>
+        </w:tc>
+        <w:tc>
+          <w:tcPr>
+            <w:tcW w:type="dxa" w:w="1134"/>
+          </w:tcPr>
+          <w:p>
+            <w:r>
+              <w:rPr>
+                <w:sz w:val="20"/>
+              </w:rPr>
+              <w:t>0.248</w:t>
+            </w:r>
+          </w:p>
+        </w:tc>
+        <w:tc>
+          <w:tcPr>
+            <w:tcW w:type="dxa" w:w="1417"/>
+          </w:tcPr>
+          <w:p>
+            <w:r>
+              <w:rPr>
+                <w:sz w:val="20"/>
+              </w:rPr>
+              <w:t>0.080</w:t>
+            </w:r>
+          </w:p>
+        </w:tc>
+      </w:tr>
+      <w:tr>
+        <w:tc>
+          <w:tcPr>
+            <w:tcW w:type="dxa" w:w="1701"/>
+            <w:shd w:val="clear" w:color="auto" w:fill="F2F2F2"/>
+          </w:tcPr>
+          <w:p>
+            <w:r>
+              <w:rPr>
+                <w:sz w:val="20"/>
+              </w:rPr>
+              <w:t>Serial biopsy</w:t>
+            </w:r>
+          </w:p>
+        </w:tc>
+        <w:tc>
+          <w:tcPr>
+            <w:tcW w:type="dxa" w:w="1984"/>
+            <w:shd w:val="clear" w:color="auto" w:fill="F2F2F2"/>
+          </w:tcPr>
+          <w:p>
+            <w:r>
+              <w:rPr>
+                <w:sz w:val="20"/>
+              </w:rPr>
+              <w:t>EPV-10 (cap=4)</w:t>
+            </w:r>
+          </w:p>
+        </w:tc>
+        <w:tc>
+          <w:tcPr>
+            <w:tcW w:type="dxa" w:w="1134"/>
+            <w:shd w:val="clear" w:color="auto" w:fill="F2F2F2"/>
+          </w:tcPr>
+          <w:p>
+            <w:r>
+              <w:rPr>
+                <w:sz w:val="20"/>
+              </w:rPr>
+              <w:t>2</w:t>
+            </w:r>
+          </w:p>
+        </w:tc>
+        <w:tc>
+          <w:tcPr>
+            <w:tcW w:type="dxa" w:w="1984"/>
+            <w:shd w:val="clear" w:color="auto" w:fill="F2F2F2"/>
+          </w:tcPr>
+          <w:p>
+            <w:r>
+              <w:rPr>
+                <w:sz w:val="20"/>
+              </w:rPr>
+              <w:t>LightGBM</w:t>
+            </w:r>
+          </w:p>
+        </w:tc>
+        <w:tc>
+          <w:tcPr>
+            <w:tcW w:type="dxa" w:w="1134"/>
+            <w:shd w:val="clear" w:color="auto" w:fill="F2F2F2"/>
+          </w:tcPr>
+          <w:p>
+            <w:r>
+              <w:rPr>
+                <w:sz w:val="20"/>
+              </w:rPr>
+              <w:t>0.625</w:t>
+            </w:r>
+          </w:p>
+        </w:tc>
+        <w:tc>
+          <w:tcPr>
+            <w:tcW w:type="dxa" w:w="1134"/>
+            <w:shd w:val="clear" w:color="auto" w:fill="F2F2F2"/>
+          </w:tcPr>
+          <w:p>
+            <w:r>
+              <w:rPr>
+                <w:sz w:val="20"/>
+              </w:rPr>
+              <w:t>0.240</w:t>
+            </w:r>
+          </w:p>
+        </w:tc>
+        <w:tc>
+          <w:tcPr>
+            <w:tcW w:type="dxa" w:w="1417"/>
+            <w:shd w:val="clear" w:color="auto" w:fill="F2F2F2"/>
+          </w:tcPr>
+          <w:p>
+            <w:r>
+              <w:rPr>
+                <w:sz w:val="20"/>
+              </w:rPr>
+              <w:t>0.431</w:t>
+            </w:r>
+          </w:p>
+        </w:tc>
+      </w:tr>
+      <w:tr>
+        <w:tc>
+          <w:tcPr>
+            <w:tcW w:type="dxa" w:w="1701"/>
+          </w:tcPr>
+          <w:p>
+            <w:r>
+              <w:rPr>
+                <w:sz w:val="20"/>
+              </w:rPr>
+              <w:t>Serial biopsy</w:t>
+            </w:r>
+          </w:p>
+        </w:tc>
+        <w:tc>
+          <w:tcPr>
+            <w:tcW w:type="dxa" w:w="1984"/>
+          </w:tcPr>
+          <w:p>
+            <w:r>
+              <w:rPr>
+                <w:sz w:val="20"/>
+              </w:rPr>
+              <w:t>EPV-5 (cap=7)</w:t>
+            </w:r>
+          </w:p>
+        </w:tc>
+        <w:tc>
+          <w:tcPr>
+            <w:tcW w:type="dxa" w:w="1134"/>
+          </w:tcPr>
+          <w:p>
+            <w:r>
+              <w:rPr>
+                <w:sz w:val="20"/>
+              </w:rPr>
+              <w:t>2</w:t>
+            </w:r>
+          </w:p>
+        </w:tc>
+        <w:tc>
+          <w:tcPr>
+            <w:tcW w:type="dxa" w:w="1984"/>
+          </w:tcPr>
+          <w:p>
+            <w:r>
+              <w:rPr>
+                <w:sz w:val="20"/>
+              </w:rPr>
+              <w:t>Logistic Regression</w:t>
+            </w:r>
+          </w:p>
+        </w:tc>
+        <w:tc>
+          <w:tcPr>
+            <w:tcW w:type="dxa" w:w="1134"/>
+          </w:tcPr>
+          <w:p>
+            <w:r>
+              <w:rPr>
+                <w:sz w:val="20"/>
+              </w:rPr>
+              <w:t>0.676</w:t>
+            </w:r>
+          </w:p>
+        </w:tc>
+        <w:tc>
+          <w:tcPr>
+            <w:tcW w:type="dxa" w:w="1134"/>
+          </w:tcPr>
+          <w:p>
+            <w:r>
+              <w:rPr>
+                <w:sz w:val="20"/>
+              </w:rPr>
+              <w:t>0.235</w:t>
+            </w:r>
+          </w:p>
+        </w:tc>
+        <w:tc>
+          <w:tcPr>
+            <w:tcW w:type="dxa" w:w="1417"/>
+          </w:tcPr>
+          <w:p>
+            <w:r>
+              <w:rPr>
+                <w:sz w:val="20"/>
+              </w:rPr>
+              <w:t>0.570</w:t>
+            </w:r>
+          </w:p>
+        </w:tc>
+      </w:tr>
+      <w:tr>
+        <w:tc>
+          <w:tcPr>
+            <w:tcW w:type="dxa" w:w="1701"/>
+            <w:shd w:val="clear" w:color="auto" w:fill="F2F2F2"/>
+          </w:tcPr>
+          <w:p>
+            <w:r>
+              <w:rPr>
+                <w:sz w:val="20"/>
+              </w:rPr>
+              <w:t>Serial biopsy</w:t>
+            </w:r>
+          </w:p>
+        </w:tc>
+        <w:tc>
+          <w:tcPr>
+            <w:tcW w:type="dxa" w:w="1984"/>
+            <w:shd w:val="clear" w:color="auto" w:fill="F2F2F2"/>
+          </w:tcPr>
+          <w:p>
+            <w:r>
+              <w:rPr>
+                <w:sz w:val="20"/>
+              </w:rPr>
+              <w:t>EPV-5 (cap=7)</w:t>
+            </w:r>
+          </w:p>
+        </w:tc>
+        <w:tc>
+          <w:tcPr>
+            <w:tcW w:type="dxa" w:w="1134"/>
+            <w:shd w:val="clear" w:color="auto" w:fill="F2F2F2"/>
+          </w:tcPr>
+          <w:p>
+            <w:r>
+              <w:rPr>
+                <w:sz w:val="20"/>
+              </w:rPr>
+              <w:t>2</w:t>
+            </w:r>
+          </w:p>
+        </w:tc>
+        <w:tc>
+          <w:tcPr>
+            <w:tcW w:type="dxa" w:w="1984"/>
+            <w:shd w:val="clear" w:color="auto" w:fill="F2F2F2"/>
+          </w:tcPr>
+          <w:p>
+            <w:r>
+              <w:rPr>
+                <w:sz w:val="20"/>
+              </w:rPr>
+              <w:t>Random Forest</w:t>
+            </w:r>
+          </w:p>
+        </w:tc>
+        <w:tc>
+          <w:tcPr>
+            <w:tcW w:type="dxa" w:w="1134"/>
+            <w:shd w:val="clear" w:color="auto" w:fill="F2F2F2"/>
+          </w:tcPr>
+          <w:p>
+            <w:r>
+              <w:rPr>
+                <w:sz w:val="20"/>
+              </w:rPr>
+              <w:t>0.629</w:t>
+            </w:r>
+          </w:p>
+        </w:tc>
+        <w:tc>
+          <w:tcPr>
+            <w:tcW w:type="dxa" w:w="1134"/>
+            <w:shd w:val="clear" w:color="auto" w:fill="F2F2F2"/>
+          </w:tcPr>
+          <w:p>
+            <w:r>
+              <w:rPr>
+                <w:sz w:val="20"/>
+              </w:rPr>
+              <w:t>0.240</w:t>
+            </w:r>
+          </w:p>
+        </w:tc>
+        <w:tc>
+          <w:tcPr>
+            <w:tcW w:type="dxa" w:w="1417"/>
+            <w:shd w:val="clear" w:color="auto" w:fill="F2F2F2"/>
+          </w:tcPr>
+          <w:p>
+            <w:r>
+              <w:rPr>
+                <w:sz w:val="20"/>
+              </w:rPr>
+              <w:t>0.381</w:t>
+            </w:r>
+          </w:p>
+        </w:tc>
+      </w:tr>
+      <w:tr>
+        <w:tc>
+          <w:tcPr>
+            <w:tcW w:type="dxa" w:w="1701"/>
+          </w:tcPr>
+          <w:p>
+            <w:r>
+              <w:rPr>
+                <w:sz w:val="20"/>
+              </w:rPr>
+              <w:t>Serial biopsy</w:t>
+            </w:r>
+          </w:p>
+        </w:tc>
+        <w:tc>
+          <w:tcPr>
+            <w:tcW w:type="dxa" w:w="1984"/>
+          </w:tcPr>
+          <w:p>
+            <w:r>
+              <w:rPr>
+                <w:sz w:val="20"/>
+              </w:rPr>
+              <w:t>EPV-5 (cap=7)</w:t>
+            </w:r>
+          </w:p>
+        </w:tc>
+        <w:tc>
+          <w:tcPr>
+            <w:tcW w:type="dxa" w:w="1134"/>
+          </w:tcPr>
+          <w:p>
+            <w:r>
+              <w:rPr>
+                <w:sz w:val="20"/>
+              </w:rPr>
+              <w:t>2</w:t>
+            </w:r>
+          </w:p>
+        </w:tc>
+        <w:tc>
+          <w:tcPr>
+            <w:tcW w:type="dxa" w:w="1984"/>
+          </w:tcPr>
+          <w:p>
+            <w:r>
+              <w:rPr>
+                <w:sz w:val="20"/>
+              </w:rPr>
+              <w:t>XGBoost</w:t>
+            </w:r>
+          </w:p>
+        </w:tc>
+        <w:tc>
+          <w:tcPr>
+            <w:tcW w:type="dxa" w:w="1134"/>
+          </w:tcPr>
+          <w:p>
+            <w:r>
+              <w:rPr>
+                <w:sz w:val="20"/>
+              </w:rPr>
+              <w:t>0.601</w:t>
+            </w:r>
+          </w:p>
+        </w:tc>
+        <w:tc>
+          <w:tcPr>
+            <w:tcW w:type="dxa" w:w="1134"/>
+          </w:tcPr>
+          <w:p>
+            <w:r>
+              <w:rPr>
+                <w:sz w:val="20"/>
+              </w:rPr>
+              <w:t>0.248</w:t>
+            </w:r>
+          </w:p>
+        </w:tc>
+        <w:tc>
+          <w:tcPr>
+            <w:tcW w:type="dxa" w:w="1417"/>
+          </w:tcPr>
+          <w:p>
+            <w:r>
+              <w:rPr>
+                <w:sz w:val="20"/>
+              </w:rPr>
+              <w:t>0.080</w:t>
+            </w:r>
+          </w:p>
+        </w:tc>
+      </w:tr>
+      <w:tr>
+        <w:tc>
+          <w:tcPr>
+            <w:tcW w:type="dxa" w:w="1701"/>
+            <w:shd w:val="clear" w:color="auto" w:fill="F2F2F2"/>
+          </w:tcPr>
+          <w:p>
+            <w:r>
+              <w:rPr>
+                <w:sz w:val="20"/>
+              </w:rPr>
+              <w:t>Serial biopsy</w:t>
+            </w:r>
+          </w:p>
+        </w:tc>
+        <w:tc>
+          <w:tcPr>
+            <w:tcW w:type="dxa" w:w="1984"/>
+            <w:shd w:val="clear" w:color="auto" w:fill="F2F2F2"/>
+          </w:tcPr>
+          <w:p>
+            <w:r>
+              <w:rPr>
+                <w:sz w:val="20"/>
+              </w:rPr>
+              <w:t>EPV-5 (cap=7)</w:t>
+            </w:r>
+          </w:p>
+        </w:tc>
+        <w:tc>
+          <w:tcPr>
+            <w:tcW w:type="dxa" w:w="1134"/>
+            <w:shd w:val="clear" w:color="auto" w:fill="F2F2F2"/>
+          </w:tcPr>
+          <w:p>
+            <w:r>
+              <w:rPr>
+                <w:sz w:val="20"/>
+              </w:rPr>
+              <w:t>2</w:t>
+            </w:r>
+          </w:p>
+        </w:tc>
+        <w:tc>
+          <w:tcPr>
+            <w:tcW w:type="dxa" w:w="1984"/>
+            <w:shd w:val="clear" w:color="auto" w:fill="F2F2F2"/>
+          </w:tcPr>
+          <w:p>
+            <w:r>
+              <w:rPr>
+                <w:sz w:val="20"/>
+              </w:rPr>
+              <w:t>LightGBM</w:t>
+            </w:r>
+          </w:p>
+        </w:tc>
+        <w:tc>
+          <w:tcPr>
+            <w:tcW w:type="dxa" w:w="1134"/>
+            <w:shd w:val="clear" w:color="auto" w:fill="F2F2F2"/>
+          </w:tcPr>
+          <w:p>
+            <w:r>
+              <w:rPr>
+                <w:sz w:val="20"/>
+              </w:rPr>
+              <w:t>0.625</w:t>
+            </w:r>
+          </w:p>
+        </w:tc>
+        <w:tc>
+          <w:tcPr>
+            <w:tcW w:type="dxa" w:w="1134"/>
+            <w:shd w:val="clear" w:color="auto" w:fill="F2F2F2"/>
+          </w:tcPr>
+          <w:p>
+            <w:r>
+              <w:rPr>
+                <w:sz w:val="20"/>
+              </w:rPr>
+              <w:t>0.240</w:t>
+            </w:r>
+          </w:p>
+        </w:tc>
+        <w:tc>
+          <w:tcPr>
+            <w:tcW w:type="dxa" w:w="1417"/>
+            <w:shd w:val="clear" w:color="auto" w:fill="F2F2F2"/>
+          </w:tcPr>
+          <w:p>
+            <w:r>
+              <w:rPr>
+                <w:sz w:val="20"/>
+              </w:rPr>
+              <w:t>0.431</w:t>
+            </w:r>
+          </w:p>
+        </w:tc>
+      </w:tr>
+    </w:tbl>
+    <w:p/>
+    <w:p>
+      <w:pPr>
+        <w:spacing w:after="120"/>
+      </w:pPr>
+      <w:r>
+        <w:t>1-Year flare: relaxing the cap materially changed results. LASSO retained 19 features instead of 12, and all three tree models improved substantially — Random Forest AUROC 0.691→0.731, XGBoost 0.684→0.720, LightGBM 0.664→0.715 — with calibration slopes moving much closer to the ideal of 1.0 (e.g. XGBoost 0.506→0.886). Logistic Regression AUROC fell slightly (0.702→0.681). This indicates the EPV-10 cap was genuinely constraining tree-model performance in this cohort, consistent with the pmsampsize finding (Section 12.1) that the 1-year cohort is formally underpowered.</w:t>
+      </w:r>
+    </w:p>
+    <w:p>
+      <w:pPr>
+        <w:spacing w:after="120"/>
+      </w:pPr>
+      <w:r>
+        <w:t>Serial biopsy: no difference whatsoever — LASSO's discrete regularisation path selected exactly the same 2 features (% chronic gloms, time between biopsies) under both caps, because (as already noted in Section 4.5) the C-search jumps directly from 12 features to 2 with no intermediate value, so neither cap was actually binding. The EPV-5 relaxation could not have changed this result regardless of cohort size.</w:t>
+      </w:r>
+    </w:p>
     <w:sectPr>
       <w:pgSz w:w="12240" w:h="15840"/>
       <w:pgMar w:top="1417" w:right="1587" w:bottom="1417" w:left="1587" w:header="720" w:footer="720" w:gutter="0"/>

</xml_diff>

<commit_message>
Update Methods doc file/script reference with everything added this session
Section 11.1 (Data Files): pmsampsize_results.xlsx, epv5_sensitivity_results.xlsx,
Lupus_Project_Results.docx, Table2_Calibration.docx, Tables_1_2_Publication.docx.

Section 11.2 (Scripts): 16_roc_calibration_plots.py, 17_optimism_barchart.py,
22_pmsampsize.py, 23_epv5_sensitivity.py, 24_table2_calibration.py,
25_tables_1_2.py, generate_results_doc.py - all previously undocumented.

Section 4.4: added a data-integrity note that Data/Processed/
lupus_5yr_selected_clean.xlsx still contains the dsDNA/SM/APL column that
was manually removed post-selection (11 vs 10 predictors), found while
verifying 16_roc_calibration_plots.py against published results.
</commit_message>
<xml_diff>
--- a/outputs/Lupus_Project_Methods.docx
+++ b/outputs/Lupus_Project_Methods.docx
@@ -38,7 +38,7 @@
         <w:rPr>
           <w:sz w:val="22"/>
         </w:rPr>
-        <w:t>Generated: 05 August 2026</w:t>
+        <w:t>Generated: 12 August 2026</w:t>
       </w:r>
     </w:p>
     <w:p>
@@ -3844,6 +3844,14 @@
       </w:pPr>
       <w:r>
         <w:t>Removed dsDNA/SM/APL ever positive: 85.1% positive (just below 90% threshold), but clinical reasoning mirrors ANA removal — insufficient discriminatory gradient to justify inclusion</w:t>
+      </w:r>
+    </w:p>
+    <w:p>
+      <w:pPr>
+        <w:spacing w:after="120"/>
+      </w:pPr>
+      <w:r>
+        <w:t>Data integrity note: as of this document's generation, Data/Processed/lupus_5yr_selected_clean.xlsx on disk still contains the dsDNA/SM/APL column (11 predictors), i.e. this manual correction has not been re-applied to the saved file since a later rerun of feature selection. Scripts loading that file directly (SHAP, DeLong, ensemble, TabPFN v3) should drop this column to reproduce the 10-predictor results below exactly; src/16_roc_calibration_plots.py does so explicitly at load time. The saved file itself should be corrected at the source when convenient.</w:t>
       </w:r>
     </w:p>
     <w:p>
@@ -18654,6 +18662,217 @@
           </w:p>
         </w:tc>
       </w:tr>
+      <w:tr>
+        <w:tc>
+          <w:tcPr>
+            <w:tcW w:type="dxa" w:w="3118"/>
+          </w:tcPr>
+          <w:p>
+            <w:r>
+              <w:rPr>
+                <w:sz w:val="20"/>
+              </w:rPr>
+              <w:t>pmsampsize_results.xlsx</w:t>
+            </w:r>
+          </w:p>
+        </w:tc>
+        <w:tc>
+          <w:tcPr>
+            <w:tcW w:type="dxa" w:w="1984"/>
+          </w:tcPr>
+          <w:p>
+            <w:r>
+              <w:rPr>
+                <w:sz w:val="20"/>
+              </w:rPr>
+              <w:t>outputs/</w:t>
+            </w:r>
+          </w:p>
+        </w:tc>
+        <w:tc>
+          <w:tcPr>
+            <w:tcW w:type="dxa" w:w="3969"/>
+          </w:tcPr>
+          <w:p>
+            <w:r>
+              <w:rPr>
+                <w:sz w:val="20"/>
+              </w:rPr>
+              <w:t>Formal sample-size justification, all 5 cohorts (Section 12.1)</w:t>
+            </w:r>
+          </w:p>
+        </w:tc>
+      </w:tr>
+      <w:tr>
+        <w:tc>
+          <w:tcPr>
+            <w:tcW w:type="dxa" w:w="3118"/>
+            <w:shd w:val="clear" w:color="auto" w:fill="F2F2F2"/>
+          </w:tcPr>
+          <w:p>
+            <w:r>
+              <w:rPr>
+                <w:sz w:val="20"/>
+              </w:rPr>
+              <w:t>epv5_sensitivity_results.xlsx</w:t>
+            </w:r>
+          </w:p>
+        </w:tc>
+        <w:tc>
+          <w:tcPr>
+            <w:tcW w:type="dxa" w:w="1984"/>
+            <w:shd w:val="clear" w:color="auto" w:fill="F2F2F2"/>
+          </w:tcPr>
+          <w:p>
+            <w:r>
+              <w:rPr>
+                <w:sz w:val="20"/>
+              </w:rPr>
+              <w:t>outputs/</w:t>
+            </w:r>
+          </w:p>
+        </w:tc>
+        <w:tc>
+          <w:tcPr>
+            <w:tcW w:type="dxa" w:w="3969"/>
+            <w:shd w:val="clear" w:color="auto" w:fill="F2F2F2"/>
+          </w:tcPr>
+          <w:p>
+            <w:r>
+              <w:rPr>
+                <w:sz w:val="20"/>
+              </w:rPr>
+              <w:t>EPV-cap sensitivity results, 1yr flare + serial biopsy (Section 12.2)</w:t>
+            </w:r>
+          </w:p>
+        </w:tc>
+      </w:tr>
+      <w:tr>
+        <w:tc>
+          <w:tcPr>
+            <w:tcW w:type="dxa" w:w="3118"/>
+          </w:tcPr>
+          <w:p>
+            <w:r>
+              <w:rPr>
+                <w:sz w:val="20"/>
+              </w:rPr>
+              <w:t>Lupus_Project_Results.docx</w:t>
+            </w:r>
+          </w:p>
+        </w:tc>
+        <w:tc>
+          <w:tcPr>
+            <w:tcW w:type="dxa" w:w="1984"/>
+          </w:tcPr>
+          <w:p>
+            <w:r>
+              <w:rPr>
+                <w:sz w:val="20"/>
+              </w:rPr>
+              <w:t>outputs/</w:t>
+            </w:r>
+          </w:p>
+        </w:tc>
+        <w:tc>
+          <w:tcPr>
+            <w:tcW w:type="dxa" w:w="3969"/>
+          </w:tcPr>
+          <w:p>
+            <w:r>
+              <w:rPr>
+                <w:sz w:val="20"/>
+              </w:rPr>
+              <w:t>Standalone results-only companion document (tables, no methods narrative)</w:t>
+            </w:r>
+          </w:p>
+        </w:tc>
+      </w:tr>
+      <w:tr>
+        <w:tc>
+          <w:tcPr>
+            <w:tcW w:type="dxa" w:w="3118"/>
+            <w:shd w:val="clear" w:color="auto" w:fill="F2F2F2"/>
+          </w:tcPr>
+          <w:p>
+            <w:r>
+              <w:rPr>
+                <w:sz w:val="20"/>
+              </w:rPr>
+              <w:t>Table2_Calibration.docx</w:t>
+            </w:r>
+          </w:p>
+        </w:tc>
+        <w:tc>
+          <w:tcPr>
+            <w:tcW w:type="dxa" w:w="1984"/>
+            <w:shd w:val="clear" w:color="auto" w:fill="F2F2F2"/>
+          </w:tcPr>
+          <w:p>
+            <w:r>
+              <w:rPr>
+                <w:sz w:val="20"/>
+              </w:rPr>
+              <w:t>outputs/</w:t>
+            </w:r>
+          </w:p>
+        </w:tc>
+        <w:tc>
+          <w:tcPr>
+            <w:tcW w:type="dxa" w:w="3969"/>
+            <w:shd w:val="clear" w:color="auto" w:fill="F2F2F2"/>
+          </w:tcPr>
+          <w:p>
+            <w:r>
+              <w:rPr>
+                <w:sz w:val="20"/>
+              </w:rPr>
+              <w:t>Standalone Table 2 (Brier/calibration slope), publication format</w:t>
+            </w:r>
+          </w:p>
+        </w:tc>
+      </w:tr>
+      <w:tr>
+        <w:tc>
+          <w:tcPr>
+            <w:tcW w:type="dxa" w:w="3118"/>
+          </w:tcPr>
+          <w:p>
+            <w:r>
+              <w:rPr>
+                <w:sz w:val="20"/>
+              </w:rPr>
+              <w:t>Tables_1_2_Publication.docx</w:t>
+            </w:r>
+          </w:p>
+        </w:tc>
+        <w:tc>
+          <w:tcPr>
+            <w:tcW w:type="dxa" w:w="1984"/>
+          </w:tcPr>
+          <w:p>
+            <w:r>
+              <w:rPr>
+                <w:sz w:val="20"/>
+              </w:rPr>
+              <w:t>outputs/</w:t>
+            </w:r>
+          </w:p>
+        </w:tc>
+        <w:tc>
+          <w:tcPr>
+            <w:tcW w:type="dxa" w:w="3969"/>
+          </w:tcPr>
+          <w:p>
+            <w:r>
+              <w:rPr>
+                <w:sz w:val="20"/>
+              </w:rPr>
+              <w:t>Combined Table 1 (AUROC) + Table 2 (calibration), publication format</w:t>
+            </w:r>
+          </w:p>
+        </w:tc>
+      </w:tr>
     </w:tbl>
     <w:p/>
     <w:p>
@@ -19443,6 +19662,180 @@
               <w:rPr>
                 <w:sz w:val="20"/>
               </w:rPr>
+              <w:t>src/16_roc_calibration_plots.py</w:t>
+            </w:r>
+          </w:p>
+        </w:tc>
+        <w:tc>
+          <w:tcPr>
+            <w:tcW w:type="dxa" w:w="5102"/>
+            <w:shd w:val="clear" w:color="auto" w:fill="F2F2F2"/>
+          </w:tcPr>
+          <w:p>
+            <w:r>
+              <w:rPr>
+                <w:sz w:val="20"/>
+              </w:rPr>
+              <w:t>ROC + calibration figures, all 5 cohorts (reuses saved best hyperparameters, no retuning)</w:t>
+            </w:r>
+          </w:p>
+        </w:tc>
+      </w:tr>
+      <w:tr>
+        <w:tc>
+          <w:tcPr>
+            <w:tcW w:type="dxa" w:w="3969"/>
+          </w:tcPr>
+          <w:p>
+            <w:r>
+              <w:rPr>
+                <w:sz w:val="20"/>
+              </w:rPr>
+              <w:t>src/17_optimism_barchart.py</w:t>
+            </w:r>
+          </w:p>
+        </w:tc>
+        <w:tc>
+          <w:tcPr>
+            <w:tcW w:type="dxa" w:w="5102"/>
+          </w:tcPr>
+          <w:p>
+            <w:r>
+              <w:rPr>
+                <w:sz w:val="20"/>
+              </w:rPr>
+              <w:t>Apparent vs bias-corrected AUROC bar chart, all 5 cohorts (reads saved bootstrap results only)</w:t>
+            </w:r>
+          </w:p>
+        </w:tc>
+      </w:tr>
+      <w:tr>
+        <w:tc>
+          <w:tcPr>
+            <w:tcW w:type="dxa" w:w="3969"/>
+            <w:shd w:val="clear" w:color="auto" w:fill="F2F2F2"/>
+          </w:tcPr>
+          <w:p>
+            <w:r>
+              <w:rPr>
+                <w:sz w:val="20"/>
+              </w:rPr>
+              <w:t>src/22_pmsampsize.py</w:t>
+            </w:r>
+          </w:p>
+        </w:tc>
+        <w:tc>
+          <w:tcPr>
+            <w:tcW w:type="dxa" w:w="5102"/>
+            <w:shd w:val="clear" w:color="auto" w:fill="F2F2F2"/>
+          </w:tcPr>
+          <w:p>
+            <w:r>
+              <w:rPr>
+                <w:sz w:val="20"/>
+              </w:rPr>
+              <w:t>Formal sample-size justification (Riley et al. 2020 criteria), all 5 cohorts</w:t>
+            </w:r>
+          </w:p>
+        </w:tc>
+      </w:tr>
+      <w:tr>
+        <w:tc>
+          <w:tcPr>
+            <w:tcW w:type="dxa" w:w="3969"/>
+          </w:tcPr>
+          <w:p>
+            <w:r>
+              <w:rPr>
+                <w:sz w:val="20"/>
+              </w:rPr>
+              <w:t>src/23_epv5_sensitivity.py</w:t>
+            </w:r>
+          </w:p>
+        </w:tc>
+        <w:tc>
+          <w:tcPr>
+            <w:tcW w:type="dxa" w:w="5102"/>
+          </w:tcPr>
+          <w:p>
+            <w:r>
+              <w:rPr>
+                <w:sz w:val="20"/>
+              </w:rPr>
+              <w:t>EPV-cap sensitivity analysis — 1-year flare and serial biopsy</w:t>
+            </w:r>
+          </w:p>
+        </w:tc>
+      </w:tr>
+      <w:tr>
+        <w:tc>
+          <w:tcPr>
+            <w:tcW w:type="dxa" w:w="3969"/>
+            <w:shd w:val="clear" w:color="auto" w:fill="F2F2F2"/>
+          </w:tcPr>
+          <w:p>
+            <w:r>
+              <w:rPr>
+                <w:sz w:val="20"/>
+              </w:rPr>
+              <w:t>src/24_table2_calibration.py</w:t>
+            </w:r>
+          </w:p>
+        </w:tc>
+        <w:tc>
+          <w:tcPr>
+            <w:tcW w:type="dxa" w:w="5102"/>
+            <w:shd w:val="clear" w:color="auto" w:fill="F2F2F2"/>
+          </w:tcPr>
+          <w:p>
+            <w:r>
+              <w:rPr>
+                <w:sz w:val="20"/>
+              </w:rPr>
+              <w:t>Generate standalone Table 2 (calibration) publication document</w:t>
+            </w:r>
+          </w:p>
+        </w:tc>
+      </w:tr>
+      <w:tr>
+        <w:tc>
+          <w:tcPr>
+            <w:tcW w:type="dxa" w:w="3969"/>
+          </w:tcPr>
+          <w:p>
+            <w:r>
+              <w:rPr>
+                <w:sz w:val="20"/>
+              </w:rPr>
+              <w:t>src/25_tables_1_2.py</w:t>
+            </w:r>
+          </w:p>
+        </w:tc>
+        <w:tc>
+          <w:tcPr>
+            <w:tcW w:type="dxa" w:w="5102"/>
+          </w:tcPr>
+          <w:p>
+            <w:r>
+              <w:rPr>
+                <w:sz w:val="20"/>
+              </w:rPr>
+              <w:t>Generate combined Table 1 (AUROC) + Table 2 (calibration) publication document</w:t>
+            </w:r>
+          </w:p>
+        </w:tc>
+      </w:tr>
+      <w:tr>
+        <w:tc>
+          <w:tcPr>
+            <w:tcW w:type="dxa" w:w="3969"/>
+            <w:shd w:val="clear" w:color="auto" w:fill="F2F2F2"/>
+          </w:tcPr>
+          <w:p>
+            <w:r>
+              <w:rPr>
+                <w:sz w:val="20"/>
+              </w:rPr>
               <w:t>src/generate_methods_doc.py</w:t>
             </w:r>
           </w:p>
@@ -19458,6 +19851,34 @@
                 <w:sz w:val="20"/>
               </w:rPr>
               <w:t>Generate this document (python-docx)</w:t>
+            </w:r>
+          </w:p>
+        </w:tc>
+      </w:tr>
+      <w:tr>
+        <w:tc>
+          <w:tcPr>
+            <w:tcW w:type="dxa" w:w="3969"/>
+          </w:tcPr>
+          <w:p>
+            <w:r>
+              <w:rPr>
+                <w:sz w:val="20"/>
+              </w:rPr>
+              <w:t>src/generate_results_doc.py</w:t>
+            </w:r>
+          </w:p>
+        </w:tc>
+        <w:tc>
+          <w:tcPr>
+            <w:tcW w:type="dxa" w:w="5102"/>
+          </w:tcPr>
+          <w:p>
+            <w:r>
+              <w:rPr>
+                <w:sz w:val="20"/>
+              </w:rPr>
+              <w:t>Generate the standalone results-only companion document (python-docx)</w:t>
             </w:r>
           </w:p>
         </w:tc>

</xml_diff>

<commit_message>
Update stale 'serial biopsy only' OOF-predictions descriptions
Now that all 5 cohorts have retained OOF predictions (previous commit),
both the Methods doc's file reference table and the benchmark script's
own docstring said 'serial biopsy only' - fixed to reflect all 5.
</commit_message>
<xml_diff>
--- a/outputs/Lupus_Project_Methods.docx
+++ b/outputs/Lupus_Project_Methods.docx
@@ -38,7 +38,7 @@
         <w:rPr>
           <w:sz w:val="22"/>
         </w:rPr>
-        <w:t>Generated: 12 August 2026</w:t>
+        <w:t>Generated: 13 August 2026</w:t>
       </w:r>
     </w:p>
     <w:p>
@@ -18941,7 +18941,7 @@
               <w:rPr>
                 <w:sz w:val="20"/>
               </w:rPr>
-              <w:t>TabPFN v3 raw OOF predictions — serial biopsy only (see Section 10.1)</w:t>
+              <w:t>TabPFN v3 raw OOF predictions — all 5 cohorts (see Section 10.1)</w:t>
             </w:r>
           </w:p>
         </w:tc>

</xml_diff>